<commit_message>
docs(gost): combined PDF with bookmarks, index links and GitHub links to repository files
</commit_message>
<xml_diff>
--- a/docs/gost/01-tehnicheskoe-zadanie.docx
+++ b/docs/gost/01-tehnicheskoe-zadanie.docx
@@ -1070,25 +1070,31 @@
       <w:r>
         <w:t xml:space="preserve">Документ составлен по материалам репозитория и измерениям, лежащим в </w:t>
       </w:r>
-      <w:r>
-        <w:rPr>
-          <w:rFonts w:ascii="Courier New" w:hAnsi="Courier New" w:cs="Courier New"/>
-          <w:sz w:val="24"/>
-          <w:szCs w:val="24"/>
-        </w:rPr>
-        <w:t xml:space="preserve">docs/spike/results/</w:t>
-      </w:r>
+      <w:hyperlink r:id="rIdLnk1" w:history="1">
+        <w:r>
+          <w:rPr>
+            <w:rStyle w:val="Hyperlink"/>
+            <w:rFonts w:ascii="Courier New" w:hAnsi="Courier New" w:cs="Courier New"/>
+            <w:sz w:val="24"/>
+            <w:szCs w:val="24"/>
+          </w:rPr>
+          <w:t xml:space="preserve">docs/spike/results/</w:t>
+        </w:r>
+      </w:hyperlink>
       <w:r>
         <w:t xml:space="preserve"> и </w:t>
       </w:r>
-      <w:r>
-        <w:rPr>
-          <w:rFonts w:ascii="Courier New" w:hAnsi="Courier New" w:cs="Courier New"/>
-          <w:sz w:val="24"/>
-          <w:szCs w:val="24"/>
-        </w:rPr>
-        <w:t xml:space="preserve">docs/perf/</w:t>
-      </w:r>
+      <w:hyperlink r:id="rIdLnk2" w:history="1">
+        <w:r>
+          <w:rPr>
+            <w:rStyle w:val="Hyperlink"/>
+            <w:rFonts w:ascii="Courier New" w:hAnsi="Courier New" w:cs="Courier New"/>
+            <w:sz w:val="24"/>
+            <w:szCs w:val="24"/>
+          </w:rPr>
+          <w:t xml:space="preserve">docs/perf/</w:t>
+        </w:r>
+      </w:hyperlink>
       <w:r>
         <w:t xml:space="preserve">, с помощью ИИ-ассистента; человеком не проверен и никем не согласован. Подписи, должности, даты согласования и обозначение документа оставлены пустыми намеренно.</w:t>
       </w:r>
@@ -1163,14 +1169,17 @@
       <w:r>
         <w:t xml:space="preserve">Полное наименование: «Детективная доска» (Detective Board) – локальный офлайн нейро-символический следователь по 20 рассказам о Шерлоке Холмсе. Условное обозначение в комплекте документации – «система», «комплекс». Версия в </w:t>
       </w:r>
-      <w:r>
-        <w:rPr>
-          <w:rFonts w:ascii="Courier New" w:hAnsi="Courier New" w:cs="Courier New"/>
-          <w:sz w:val="24"/>
-          <w:szCs w:val="24"/>
-        </w:rPr>
-        <w:t xml:space="preserve">pyproject.toml</w:t>
-      </w:r>
+      <w:hyperlink r:id="rIdLnk3" w:history="1">
+        <w:r>
+          <w:rPr>
+            <w:rStyle w:val="Hyperlink"/>
+            <w:rFonts w:ascii="Courier New" w:hAnsi="Courier New" w:cs="Courier New"/>
+            <w:sz w:val="24"/>
+            <w:szCs w:val="24"/>
+          </w:rPr>
+          <w:t xml:space="preserve">pyproject.toml</w:t>
+        </w:r>
+      </w:hyperlink>
       <w:r>
         <w:t xml:space="preserve">: 0.0.1.</w:t>
       </w:r>
@@ -1220,36 +1229,45 @@
       <w:r>
         <w:t xml:space="preserve">: подписанного заказчиком технического задания в репозитории нет. Источниками требований служат </w:t>
       </w:r>
-      <w:r>
-        <w:rPr>
-          <w:rFonts w:ascii="Courier New" w:hAnsi="Courier New" w:cs="Courier New"/>
-          <w:sz w:val="24"/>
-          <w:szCs w:val="24"/>
-        </w:rPr>
-        <w:t xml:space="preserve">docs/PRD.md</w:t>
-      </w:r>
+      <w:hyperlink r:id="rIdLnk4" w:history="1">
+        <w:r>
+          <w:rPr>
+            <w:rStyle w:val="Hyperlink"/>
+            <w:rFonts w:ascii="Courier New" w:hAnsi="Courier New" w:cs="Courier New"/>
+            <w:sz w:val="24"/>
+            <w:szCs w:val="24"/>
+          </w:rPr>
+          <w:t xml:space="preserve">docs/PRD.md</w:t>
+        </w:r>
+      </w:hyperlink>
       <w:r>
         <w:t xml:space="preserve"> (draft 2 от 23.10.2026), решения заказчика от 22.10.2026, зафиксированные в </w:t>
       </w:r>
-      <w:r>
-        <w:rPr>
-          <w:rFonts w:ascii="Courier New" w:hAnsi="Courier New" w:cs="Courier New"/>
-          <w:sz w:val="24"/>
-          <w:szCs w:val="24"/>
-        </w:rPr>
-        <w:t xml:space="preserve">docs/design/demo-script.md</w:t>
-      </w:r>
+      <w:hyperlink r:id="rIdLnk5" w:history="1">
+        <w:r>
+          <w:rPr>
+            <w:rStyle w:val="Hyperlink"/>
+            <w:rFonts w:ascii="Courier New" w:hAnsi="Courier New" w:cs="Courier New"/>
+            <w:sz w:val="24"/>
+            <w:szCs w:val="24"/>
+          </w:rPr>
+          <w:t xml:space="preserve">docs/design/demo-script.md</w:t>
+        </w:r>
+      </w:hyperlink>
       <w:r>
         <w:t xml:space="preserve">, и принятые ADR (</w:t>
       </w:r>
-      <w:r>
-        <w:rPr>
-          <w:rFonts w:ascii="Courier New" w:hAnsi="Courier New" w:cs="Courier New"/>
-          <w:sz w:val="24"/>
-          <w:szCs w:val="24"/>
-        </w:rPr>
-        <w:t xml:space="preserve">docs/adr/</w:t>
-      </w:r>
+      <w:hyperlink r:id="rIdLnk6" w:history="1">
+        <w:r>
+          <w:rPr>
+            <w:rStyle w:val="Hyperlink"/>
+            <w:rFonts w:ascii="Courier New" w:hAnsi="Courier New" w:cs="Courier New"/>
+            <w:sz w:val="24"/>
+            <w:szCs w:val="24"/>
+          </w:rPr>
+          <w:t xml:space="preserve">docs/adr/</w:t>
+        </w:r>
+      </w:hyperlink>
       <w:r>
         <w:t xml:space="preserve">). Для каждого требования указан статус выполнения на дату составления.</w:t>
       </w:r>
@@ -1273,14 +1291,17 @@
       <w:r>
         <w:t xml:space="preserve">Документ-основание: </w:t>
       </w:r>
-      <w:r>
-        <w:rPr>
-          <w:rFonts w:ascii="Courier New" w:hAnsi="Courier New" w:cs="Courier New"/>
-          <w:sz w:val="24"/>
-          <w:szCs w:val="24"/>
-        </w:rPr>
-        <w:t xml:space="preserve">docs/PRD.md</w:t>
-      </w:r>
+      <w:hyperlink r:id="rIdLnk7" w:history="1">
+        <w:r>
+          <w:rPr>
+            <w:rStyle w:val="Hyperlink"/>
+            <w:rFonts w:ascii="Courier New" w:hAnsi="Courier New" w:cs="Courier New"/>
+            <w:sz w:val="24"/>
+            <w:szCs w:val="24"/>
+          </w:rPr>
+          <w:t xml:space="preserve">docs/PRD.md</w:t>
+        </w:r>
+      </w:hyperlink>
       <w:r>
         <w:t xml:space="preserve"> (положение о продукте, цели, не-цели, ограничения). Приказ, договор или задание на проект: </w:t>
       </w:r>
@@ -1337,14 +1358,17 @@
       <w:r>
         <w:t xml:space="preserve">Наименование темы разработки: «Local GraphRAG investigator agent over Sherlock Holmes stories» (</w:t>
       </w:r>
-      <w:r>
-        <w:rPr>
-          <w:rFonts w:ascii="Courier New" w:hAnsi="Courier New" w:cs="Courier New"/>
-          <w:sz w:val="24"/>
-          <w:szCs w:val="24"/>
-        </w:rPr>
-        <w:t xml:space="preserve">pyproject.toml</w:t>
-      </w:r>
+      <w:hyperlink r:id="rIdLnk8" w:history="1">
+        <w:r>
+          <w:rPr>
+            <w:rStyle w:val="Hyperlink"/>
+            <w:rFonts w:ascii="Courier New" w:hAnsi="Courier New" w:cs="Courier New"/>
+            <w:sz w:val="24"/>
+            <w:szCs w:val="24"/>
+          </w:rPr>
+          <w:t xml:space="preserve">pyproject.toml</w:t>
+        </w:r>
+      </w:hyperlink>
       <w:r>
         <w:t xml:space="preserve">).</w:t>
       </w:r>
@@ -1558,14 +1582,17 @@
               </w:rPr>
               <w:t xml:space="preserve"> на test-срезе (n=30): «поведение корректно» у агента 13/30, у векторного поиска 11/30, у «голой» модели 3/30 (</w:t>
             </w:r>
-            <w:r>
-              <w:rPr>
-                <w:rFonts w:ascii="Courier New" w:hAnsi="Courier New" w:cs="Courier New"/>
-                <w:sz w:val="20"/>
-                <w:szCs w:val="20"/>
-              </w:rPr>
-              <w:t xml:space="preserve">docs/spike/results/eval-2026-10-28-test-7b7b197-7857839ed9be-175321.md</w:t>
-            </w:r>
+            <w:hyperlink r:id="rIdLnk9" w:history="1">
+              <w:r>
+                <w:rPr>
+                  <w:rStyle w:val="Hyperlink"/>
+                  <w:rFonts w:ascii="Courier New" w:hAnsi="Courier New" w:cs="Courier New"/>
+                  <w:sz w:val="20"/>
+                  <w:szCs w:val="20"/>
+                </w:rPr>
+                <w:t xml:space="preserve">docs/spike/results/eval-2026-10-28-test-7b7b197-7857839ed9be-175321.md</w:t>
+              </w:r>
+            </w:hyperlink>
             <w:r>
               <w:rPr>
                 <w:sz w:val="24"/>
@@ -1629,14 +1656,17 @@
               </w:rPr>
               <w:t xml:space="preserve">Реализовано в </w:t>
             </w:r>
-            <w:r>
-              <w:rPr>
-                <w:rFonts w:ascii="Courier New" w:hAnsi="Courier New" w:cs="Courier New"/>
-                <w:sz w:val="20"/>
-                <w:szCs w:val="20"/>
-              </w:rPr>
-              <w:t xml:space="preserve">src/detective_board/symbolic/</w:t>
-            </w:r>
+            <w:hyperlink r:id="rIdLnk10" w:history="1">
+              <w:r>
+                <w:rPr>
+                  <w:rStyle w:val="Hyperlink"/>
+                  <w:rFonts w:ascii="Courier New" w:hAnsi="Courier New" w:cs="Courier New"/>
+                  <w:sz w:val="20"/>
+                  <w:szCs w:val="20"/>
+                </w:rPr>
+                <w:t xml:space="preserve">src/detective_board/symbolic/</w:t>
+              </w:r>
+            </w:hyperlink>
             <w:r>
               <w:rPr>
                 <w:sz w:val="24"/>
@@ -1659,14 +1689,17 @@
               </w:rPr>
               <w:t xml:space="preserve">: на автоматически построенном графе правила не нашли противоречий в 19 из 20 рассказов; единственная находка – курируемый случай Wisteria Lodge (</w:t>
             </w:r>
-            <w:r>
-              <w:rPr>
-                <w:rFonts w:ascii="Courier New" w:hAnsi="Courier New" w:cs="Courier New"/>
-                <w:sz w:val="20"/>
-                <w:szCs w:val="20"/>
-              </w:rPr>
-              <w:t xml:space="preserve">docs/spike/results/graph-sanity-20261028.md</w:t>
-            </w:r>
+            <w:hyperlink r:id="rIdLnk11" w:history="1">
+              <w:r>
+                <w:rPr>
+                  <w:rStyle w:val="Hyperlink"/>
+                  <w:rFonts w:ascii="Courier New" w:hAnsi="Courier New" w:cs="Courier New"/>
+                  <w:sz w:val="20"/>
+                  <w:szCs w:val="20"/>
+                </w:rPr>
+                <w:t xml:space="preserve">docs/spike/results/graph-sanity-20261028.md</w:t>
+              </w:r>
+            </w:hyperlink>
             <w:r>
               <w:rPr>
                 <w:sz w:val="24"/>
@@ -1932,14 +1965,17 @@
               </w:rPr>
               <w:t xml:space="preserve">, в системе не подключены (</w:t>
             </w:r>
-            <w:r>
-              <w:rPr>
-                <w:rFonts w:ascii="Courier New" w:hAnsi="Courier New" w:cs="Courier New"/>
-                <w:sz w:val="20"/>
-                <w:szCs w:val="20"/>
-              </w:rPr>
-              <w:t xml:space="preserve">docs/security.md</w:t>
-            </w:r>
+            <w:hyperlink r:id="rIdLnk12" w:history="1">
+              <w:r>
+                <w:rPr>
+                  <w:rStyle w:val="Hyperlink"/>
+                  <w:rFonts w:ascii="Courier New" w:hAnsi="Courier New" w:cs="Courier New"/>
+                  <w:sz w:val="20"/>
+                  <w:szCs w:val="20"/>
+                </w:rPr>
+                <w:t xml:space="preserve">docs/security.md</w:t>
+              </w:r>
+            </w:hyperlink>
             <w:r>
               <w:rPr>
                 <w:sz w:val="24"/>
@@ -2089,14 +2125,17 @@
               </w:rPr>
               <w:t xml:space="preserve">Реализован </w:t>
             </w:r>
-            <w:r>
-              <w:rPr>
-                <w:rFonts w:ascii="Courier New" w:hAnsi="Courier New" w:cs="Courier New"/>
-                <w:sz w:val="20"/>
-                <w:szCs w:val="20"/>
-              </w:rPr>
-              <w:t xml:space="preserve">eval/run_eval.py</w:t>
-            </w:r>
+            <w:hyperlink r:id="rIdLnk13" w:history="1">
+              <w:r>
+                <w:rPr>
+                  <w:rStyle w:val="Hyperlink"/>
+                  <w:rFonts w:ascii="Courier New" w:hAnsi="Courier New" w:cs="Courier New"/>
+                  <w:sz w:val="20"/>
+                  <w:szCs w:val="20"/>
+                </w:rPr>
+                <w:t xml:space="preserve">eval/run_eval.py</w:t>
+              </w:r>
+            </w:hyperlink>
             <w:r>
               <w:rPr>
                 <w:sz w:val="24"/>
@@ -2205,14 +2244,17 @@
               </w:rPr>
               <w:t xml:space="preserve">); тесты </w:t>
             </w:r>
-            <w:r>
-              <w:rPr>
-                <w:rFonts w:ascii="Courier New" w:hAnsi="Courier New" w:cs="Courier New"/>
-                <w:sz w:val="20"/>
-                <w:szCs w:val="20"/>
-              </w:rPr>
-              <w:t xml:space="preserve">tests/mcp/</w:t>
-            </w:r>
+            <w:hyperlink r:id="rIdLnk14" w:history="1">
+              <w:r>
+                <w:rPr>
+                  <w:rStyle w:val="Hyperlink"/>
+                  <w:rFonts w:ascii="Courier New" w:hAnsi="Courier New" w:cs="Courier New"/>
+                  <w:sz w:val="20"/>
+                  <w:szCs w:val="20"/>
+                </w:rPr>
+                <w:t xml:space="preserve">tests/mcp/</w:t>
+              </w:r>
+            </w:hyperlink>
             <w:r>
               <w:rPr>
                 <w:sz w:val="24"/>
@@ -2220,14 +2262,17 @@
               </w:rPr>
               <w:t xml:space="preserve">, </w:t>
             </w:r>
-            <w:r>
-              <w:rPr>
-                <w:rFonts w:ascii="Courier New" w:hAnsi="Courier New" w:cs="Courier New"/>
-                <w:sz w:val="20"/>
-                <w:szCs w:val="20"/>
-              </w:rPr>
-              <w:t xml:space="preserve">tests/symbolic/</w:t>
-            </w:r>
+            <w:hyperlink r:id="rIdLnk15" w:history="1">
+              <w:r>
+                <w:rPr>
+                  <w:rStyle w:val="Hyperlink"/>
+                  <w:rFonts w:ascii="Courier New" w:hAnsi="Courier New" w:cs="Courier New"/>
+                  <w:sz w:val="20"/>
+                  <w:szCs w:val="20"/>
+                </w:rPr>
+                <w:t xml:space="preserve">tests/symbolic/</w:t>
+              </w:r>
+            </w:hyperlink>
             <w:r>
               <w:rPr>
                 <w:sz w:val="24"/>
@@ -2329,14 +2374,17 @@
               </w:rPr>
               <w:t xml:space="preserve"> (</w:t>
             </w:r>
-            <w:r>
-              <w:rPr>
-                <w:rFonts w:ascii="Courier New" w:hAnsi="Courier New" w:cs="Courier New"/>
-                <w:sz w:val="20"/>
-                <w:szCs w:val="20"/>
-              </w:rPr>
-              <w:t xml:space="preserve">docs/perf/clean-install-20261029.md</w:t>
-            </w:r>
+            <w:hyperlink r:id="rIdLnk16" w:history="1">
+              <w:r>
+                <w:rPr>
+                  <w:rStyle w:val="Hyperlink"/>
+                  <w:rFonts w:ascii="Courier New" w:hAnsi="Courier New" w:cs="Courier New"/>
+                  <w:sz w:val="20"/>
+                  <w:szCs w:val="20"/>
+                </w:rPr>
+                <w:t xml:space="preserve">docs/perf/clean-install-20261029.md</w:t>
+              </w:r>
+            </w:hyperlink>
             <w:r>
               <w:rPr>
                 <w:sz w:val="24"/>
@@ -2650,14 +2698,17 @@
       <w:r>
         <w:t xml:space="preserve">); трасса, выданная ранее, остаётся действительной (</w:t>
       </w:r>
-      <w:r>
-        <w:rPr>
-          <w:rFonts w:ascii="Courier New" w:hAnsi="Courier New" w:cs="Courier New"/>
-          <w:sz w:val="24"/>
-          <w:szCs w:val="24"/>
-        </w:rPr>
-        <w:t xml:space="preserve">docs/api.md</w:t>
-      </w:r>
+      <w:hyperlink r:id="rIdLnk17" w:history="1">
+        <w:r>
+          <w:rPr>
+            <w:rStyle w:val="Hyperlink"/>
+            <w:rFonts w:ascii="Courier New" w:hAnsi="Courier New" w:cs="Courier New"/>
+            <w:sz w:val="24"/>
+            <w:szCs w:val="24"/>
+          </w:rPr>
+          <w:t xml:space="preserve">docs/api.md</w:t>
+        </w:r>
+      </w:hyperlink>
       <w:r>
         <w:t xml:space="preserve">).</w:t>
       </w:r>
@@ -2732,14 +2783,17 @@
       <w:r>
         <w:t xml:space="preserve">Целевое устройство: ноутбук ThinkPad X1 Carbon 7-го поколения (i7-8665U, 4 ядра, 15 ГиБ ОЗУ, без GPU), Linux x86_64, сеть отключена. Среда разработки: macOS. Устройство работает на сетевом питании; для долгого показа нужен отвод тепла: температура корпуса процессора в измерениях 98–100 °C (</w:t>
       </w:r>
-      <w:r>
-        <w:rPr>
-          <w:rFonts w:ascii="Courier New" w:hAnsi="Courier New" w:cs="Courier New"/>
-          <w:sz w:val="24"/>
-          <w:szCs w:val="24"/>
-        </w:rPr>
-        <w:t xml:space="preserve">docs/perf/laptop-20261029.md</w:t>
-      </w:r>
+      <w:hyperlink r:id="rIdLnk18" w:history="1">
+        <w:r>
+          <w:rPr>
+            <w:rStyle w:val="Hyperlink"/>
+            <w:rFonts w:ascii="Courier New" w:hAnsi="Courier New" w:cs="Courier New"/>
+            <w:sz w:val="24"/>
+            <w:szCs w:val="24"/>
+          </w:rPr>
+          <w:t xml:space="preserve">docs/perf/laptop-20261029.md</w:t>
+        </w:r>
+      </w:hyperlink>
       <w:r>
         <w:t xml:space="preserve">).</w:t>
       </w:r>
@@ -2784,14 +2838,17 @@
       <w:r>
         <w:t xml:space="preserve">, </w:t>
       </w:r>
-      <w:r>
-        <w:rPr>
-          <w:rFonts w:ascii="Courier New" w:hAnsi="Courier New" w:cs="Courier New"/>
-          <w:sz w:val="24"/>
-          <w:szCs w:val="24"/>
-        </w:rPr>
-        <w:t xml:space="preserve">docs/perf/laptop-20261029.md</w:t>
-      </w:r>
+      <w:hyperlink r:id="rIdLnk19" w:history="1">
+        <w:r>
+          <w:rPr>
+            <w:rStyle w:val="Hyperlink"/>
+            <w:rFonts w:ascii="Courier New" w:hAnsi="Courier New" w:cs="Courier New"/>
+            <w:sz w:val="24"/>
+            <w:szCs w:val="24"/>
+          </w:rPr>
+          <w:t xml:space="preserve">docs/perf/laptop-20261029.md</w:t>
+        </w:r>
+      </w:hyperlink>
       <w:r>
         <w:t xml:space="preserve">); профиль 8 ГБ </w:t>
       </w:r>
@@ -2816,14 +2873,17 @@
       <w:r>
         <w:t xml:space="preserve">Диск: около 2,5 размера офлайн-архива; архив rc4 – 6,2 ГБ (</w:t>
       </w:r>
-      <w:r>
-        <w:rPr>
-          <w:rFonts w:ascii="Courier New" w:hAnsi="Courier New" w:cs="Courier New"/>
-          <w:sz w:val="24"/>
-          <w:szCs w:val="24"/>
-        </w:rPr>
-        <w:t xml:space="preserve">docs/perf/clean-install-20261029.md</w:t>
-      </w:r>
+      <w:hyperlink r:id="rIdLnk20" w:history="1">
+        <w:r>
+          <w:rPr>
+            <w:rStyle w:val="Hyperlink"/>
+            <w:rFonts w:ascii="Courier New" w:hAnsi="Courier New" w:cs="Courier New"/>
+            <w:sz w:val="24"/>
+            <w:szCs w:val="24"/>
+          </w:rPr>
+          <w:t xml:space="preserve">docs/perf/clean-install-20261029.md</w:t>
+        </w:r>
+      </w:hyperlink>
       <w:r>
         <w:t xml:space="preserve">).</w:t>
       </w:r>
@@ -2848,14 +2908,17 @@
       <w:r>
         <w:t xml:space="preserve">: медиана 28,4 с по 16 отвеченным вопросам, диапазон 18,6–44,1 с (холодный старт 44,1 с) – не на «чистом» окне (</w:t>
       </w:r>
-      <w:r>
-        <w:rPr>
-          <w:rFonts w:ascii="Courier New" w:hAnsi="Courier New" w:cs="Courier New"/>
-          <w:sz w:val="24"/>
-          <w:szCs w:val="24"/>
-        </w:rPr>
-        <w:t xml:space="preserve">docs/perf/laptop-20261029.md</w:t>
-      </w:r>
+      <w:hyperlink r:id="rIdLnk21" w:history="1">
+        <w:r>
+          <w:rPr>
+            <w:rStyle w:val="Hyperlink"/>
+            <w:rFonts w:ascii="Courier New" w:hAnsi="Courier New" w:cs="Courier New"/>
+            <w:sz w:val="24"/>
+            <w:szCs w:val="24"/>
+          </w:rPr>
+          <w:t xml:space="preserve">docs/perf/laptop-20261029.md</w:t>
+        </w:r>
+      </w:hyperlink>
       <w:r>
         <w:t xml:space="preserve">).</w:t>
       </w:r>
@@ -3000,14 +3063,17 @@
             <w:pPr>
               <w:pStyle w:val="TableText"/>
             </w:pPr>
-            <w:r>
-              <w:rPr>
-                <w:rFonts w:ascii="Courier New" w:hAnsi="Courier New" w:cs="Courier New"/>
-                <w:sz w:val="20"/>
-                <w:szCs w:val="20"/>
-              </w:rPr>
-              <w:t xml:space="preserve">pyproject.toml</w:t>
-            </w:r>
+            <w:hyperlink r:id="rIdLnk22" w:history="1">
+              <w:r>
+                <w:rPr>
+                  <w:rStyle w:val="Hyperlink"/>
+                  <w:rFonts w:ascii="Courier New" w:hAnsi="Courier New" w:cs="Courier New"/>
+                  <w:sz w:val="20"/>
+                  <w:szCs w:val="20"/>
+                </w:rPr>
+                <w:t xml:space="preserve">pyproject.toml</w:t>
+              </w:r>
+            </w:hyperlink>
           </w:p>
         </w:tc>
       </w:tr>
@@ -3057,14 +3123,17 @@
             <w:pPr>
               <w:pStyle w:val="TableText"/>
             </w:pPr>
-            <w:r>
-              <w:rPr>
-                <w:rFonts w:ascii="Courier New" w:hAnsi="Courier New" w:cs="Courier New"/>
-                <w:sz w:val="20"/>
-                <w:szCs w:val="20"/>
-              </w:rPr>
-              <w:t xml:space="preserve">justfile</w:t>
-            </w:r>
+            <w:hyperlink r:id="rIdLnk23" w:history="1">
+              <w:r>
+                <w:rPr>
+                  <w:rStyle w:val="Hyperlink"/>
+                  <w:rFonts w:ascii="Courier New" w:hAnsi="Courier New" w:cs="Courier New"/>
+                  <w:sz w:val="20"/>
+                  <w:szCs w:val="20"/>
+                </w:rPr>
+                <w:t xml:space="preserve">justfile</w:t>
+              </w:r>
+            </w:hyperlink>
             <w:r>
               <w:rPr>
                 <w:sz w:val="24"/>
@@ -3128,14 +3197,17 @@
               </w:rPr>
               <w:t xml:space="preserve">ADR-0002, </w:t>
             </w:r>
-            <w:r>
-              <w:rPr>
-                <w:rFonts w:ascii="Courier New" w:hAnsi="Courier New" w:cs="Courier New"/>
-                <w:sz w:val="20"/>
-                <w:szCs w:val="20"/>
-              </w:rPr>
-              <w:t xml:space="preserve">pyproject.toml</w:t>
-            </w:r>
+            <w:hyperlink r:id="rIdLnk24" w:history="1">
+              <w:r>
+                <w:rPr>
+                  <w:rStyle w:val="Hyperlink"/>
+                  <w:rFonts w:ascii="Courier New" w:hAnsi="Courier New" w:cs="Courier New"/>
+                  <w:sz w:val="20"/>
+                  <w:szCs w:val="20"/>
+                </w:rPr>
+                <w:t xml:space="preserve">pyproject.toml</w:t>
+              </w:r>
+            </w:hyperlink>
           </w:p>
         </w:tc>
       </w:tr>
@@ -3263,14 +3335,17 @@
               </w:rPr>
               <w:t xml:space="preserve">ADR-0003, </w:t>
             </w:r>
-            <w:r>
-              <w:rPr>
-                <w:rFonts w:ascii="Courier New" w:hAnsi="Courier New" w:cs="Courier New"/>
-                <w:sz w:val="20"/>
-                <w:szCs w:val="20"/>
-              </w:rPr>
-              <w:t xml:space="preserve">pyproject.toml</w:t>
-            </w:r>
+            <w:hyperlink r:id="rIdLnk25" w:history="1">
+              <w:r>
+                <w:rPr>
+                  <w:rStyle w:val="Hyperlink"/>
+                  <w:rFonts w:ascii="Courier New" w:hAnsi="Courier New" w:cs="Courier New"/>
+                  <w:sz w:val="20"/>
+                  <w:szCs w:val="20"/>
+                </w:rPr>
+                <w:t xml:space="preserve">pyproject.toml</w:t>
+              </w:r>
+            </w:hyperlink>
           </w:p>
         </w:tc>
       </w:tr>
@@ -3320,14 +3395,17 @@
             <w:pPr>
               <w:pStyle w:val="TableText"/>
             </w:pPr>
-            <w:r>
-              <w:rPr>
-                <w:rFonts w:ascii="Courier New" w:hAnsi="Courier New" w:cs="Courier New"/>
-                <w:sz w:val="20"/>
-                <w:szCs w:val="20"/>
-              </w:rPr>
-              <w:t xml:space="preserve">pyproject.toml</w:t>
-            </w:r>
+            <w:hyperlink r:id="rIdLnk26" w:history="1">
+              <w:r>
+                <w:rPr>
+                  <w:rStyle w:val="Hyperlink"/>
+                  <w:rFonts w:ascii="Courier New" w:hAnsi="Courier New" w:cs="Courier New"/>
+                  <w:sz w:val="20"/>
+                  <w:szCs w:val="20"/>
+                </w:rPr>
+                <w:t xml:space="preserve">pyproject.toml</w:t>
+              </w:r>
+            </w:hyperlink>
           </w:p>
         </w:tc>
       </w:tr>
@@ -3377,14 +3455,17 @@
             <w:pPr>
               <w:pStyle w:val="TableText"/>
             </w:pPr>
-            <w:r>
-              <w:rPr>
-                <w:rFonts w:ascii="Courier New" w:hAnsi="Courier New" w:cs="Courier New"/>
-                <w:sz w:val="20"/>
-                <w:szCs w:val="20"/>
-              </w:rPr>
-              <w:t xml:space="preserve">docs/perf/clean-install-20261029.md</w:t>
-            </w:r>
+            <w:hyperlink r:id="rIdLnk27" w:history="1">
+              <w:r>
+                <w:rPr>
+                  <w:rStyle w:val="Hyperlink"/>
+                  <w:rFonts w:ascii="Courier New" w:hAnsi="Courier New" w:cs="Courier New"/>
+                  <w:sz w:val="20"/>
+                  <w:szCs w:val="20"/>
+                </w:rPr>
+                <w:t xml:space="preserve">docs/perf/clean-install-20261029.md</w:t>
+              </w:r>
+            </w:hyperlink>
           </w:p>
         </w:tc>
       </w:tr>
@@ -3434,14 +3515,17 @@
             <w:pPr>
               <w:pStyle w:val="TableText"/>
             </w:pPr>
-            <w:r>
-              <w:rPr>
-                <w:rFonts w:ascii="Courier New" w:hAnsi="Courier New" w:cs="Courier New"/>
-                <w:sz w:val="20"/>
-                <w:szCs w:val="20"/>
-              </w:rPr>
-              <w:t xml:space="preserve">docs/team/models.md</w:t>
-            </w:r>
+            <w:hyperlink r:id="rIdLnk28" w:history="1">
+              <w:r>
+                <w:rPr>
+                  <w:rStyle w:val="Hyperlink"/>
+                  <w:rFonts w:ascii="Courier New" w:hAnsi="Courier New" w:cs="Courier New"/>
+                  <w:sz w:val="20"/>
+                  <w:szCs w:val="20"/>
+                </w:rPr>
+                <w:t xml:space="preserve">docs/team/models.md</w:t>
+              </w:r>
+            </w:hyperlink>
             <w:r>
               <w:rPr>
                 <w:sz w:val="24"/>
@@ -3528,14 +3612,17 @@
               </w:rPr>
               <w:t xml:space="preserve">, </w:t>
             </w:r>
-            <w:r>
-              <w:rPr>
-                <w:rFonts w:ascii="Courier New" w:hAnsi="Courier New" w:cs="Courier New"/>
-                <w:sz w:val="20"/>
-                <w:szCs w:val="20"/>
-              </w:rPr>
-              <w:t xml:space="preserve">justfile</w:t>
-            </w:r>
+            <w:hyperlink r:id="rIdLnk29" w:history="1">
+              <w:r>
+                <w:rPr>
+                  <w:rStyle w:val="Hyperlink"/>
+                  <w:rFonts w:ascii="Courier New" w:hAnsi="Courier New" w:cs="Courier New"/>
+                  <w:sz w:val="20"/>
+                  <w:szCs w:val="20"/>
+                </w:rPr>
+                <w:t xml:space="preserve">justfile</w:t>
+              </w:r>
+            </w:hyperlink>
           </w:p>
         </w:tc>
       </w:tr>
@@ -3560,14 +3647,17 @@
       <w:r>
         <w:t xml:space="preserve">, </w:t>
       </w:r>
-      <w:r>
-        <w:rPr>
-          <w:rFonts w:ascii="Courier New" w:hAnsi="Courier New" w:cs="Courier New"/>
-          <w:sz w:val="24"/>
-          <w:szCs w:val="24"/>
-        </w:rPr>
-        <w:t xml:space="preserve">data/chunks.jsonl</w:t>
-      </w:r>
+      <w:hyperlink r:id="rIdLnk30" w:history="1">
+        <w:r>
+          <w:rPr>
+            <w:rStyle w:val="Hyperlink"/>
+            <w:rFonts w:ascii="Courier New" w:hAnsi="Courier New" w:cs="Courier New"/>
+            <w:sz w:val="24"/>
+            <w:szCs w:val="24"/>
+          </w:rPr>
+          <w:t xml:space="preserve">data/chunks.jsonl</w:t>
+        </w:r>
+      </w:hyperlink>
       <w:r>
         <w:t xml:space="preserve"> (596 фрагментов). Бинарные файлы индексов и графа в git не хранятся (</w:t>
       </w:r>
@@ -3661,14 +3751,17 @@
       <w:r>
         <w:t xml:space="preserve"> (</w:t>
       </w:r>
-      <w:r>
-        <w:rPr>
-          <w:rFonts w:ascii="Courier New" w:hAnsi="Courier New" w:cs="Courier New"/>
-          <w:sz w:val="24"/>
-          <w:szCs w:val="24"/>
-        </w:rPr>
-        <w:t xml:space="preserve">scripts/pack_offline.sh</w:t>
-      </w:r>
+      <w:hyperlink r:id="rIdLnk31" w:history="1">
+        <w:r>
+          <w:rPr>
+            <w:rStyle w:val="Hyperlink"/>
+            <w:rFonts w:ascii="Courier New" w:hAnsi="Courier New" w:cs="Courier New"/>
+            <w:sz w:val="24"/>
+            <w:szCs w:val="24"/>
+          </w:rPr>
+          <w:t xml:space="preserve">scripts/pack_offline.sh</w:t>
+        </w:r>
+      </w:hyperlink>
       <w:r>
         <w:t xml:space="preserve">). Отдельная упаковка не предусмотрена.</w:t>
       </w:r>
@@ -3725,14 +3818,17 @@
       <w:r>
         <w:t xml:space="preserve">Текст корпуса – данные, а не инструкции: фрагменты передаются модели только внутри ограждённых блоков (</w:t>
       </w:r>
-      <w:r>
-        <w:rPr>
-          <w:rFonts w:ascii="Courier New" w:hAnsi="Courier New" w:cs="Courier New"/>
-          <w:sz w:val="24"/>
-          <w:szCs w:val="24"/>
-        </w:rPr>
-        <w:t xml:space="preserve">docs/security.md</w:t>
-      </w:r>
+      <w:hyperlink r:id="rIdLnk32" w:history="1">
+        <w:r>
+          <w:rPr>
+            <w:rStyle w:val="Hyperlink"/>
+            <w:rFonts w:ascii="Courier New" w:hAnsi="Courier New" w:cs="Courier New"/>
+            <w:sz w:val="24"/>
+            <w:szCs w:val="24"/>
+          </w:rPr>
+          <w:t xml:space="preserve">docs/security.md</w:t>
+        </w:r>
+      </w:hyperlink>
       <w:r>
         <w:t xml:space="preserve">, раздел 1).</w:t>
       </w:r>
@@ -3748,14 +3844,17 @@
       <w:r>
         <w:t xml:space="preserve">Использование без сети и без облачных моделей во время показа (</w:t>
       </w:r>
-      <w:r>
-        <w:rPr>
-          <w:rFonts w:ascii="Courier New" w:hAnsi="Courier New" w:cs="Courier New"/>
-          <w:sz w:val="24"/>
-          <w:szCs w:val="24"/>
-        </w:rPr>
-        <w:t xml:space="preserve">docs/DISCLOSURE.md</w:t>
-      </w:r>
+      <w:hyperlink r:id="rIdLnk33" w:history="1">
+        <w:r>
+          <w:rPr>
+            <w:rStyle w:val="Hyperlink"/>
+            <w:rFonts w:ascii="Courier New" w:hAnsi="Courier New" w:cs="Courier New"/>
+            <w:sz w:val="24"/>
+            <w:szCs w:val="24"/>
+          </w:rPr>
+          <w:t xml:space="preserve">docs/DISCLOSURE.md</w:t>
+        </w:r>
+      </w:hyperlink>
       <w:r>
         <w:t xml:space="preserve">).</w:t>
       </w:r>
@@ -3771,14 +3870,17 @@
       <w:r>
         <w:t xml:space="preserve">Раскрытие того, что вычислено на другом оборудовании, какие модели использованы, какие факты курируются людьми (</w:t>
       </w:r>
-      <w:r>
-        <w:rPr>
-          <w:rFonts w:ascii="Courier New" w:hAnsi="Courier New" w:cs="Courier New"/>
-          <w:sz w:val="24"/>
-          <w:szCs w:val="24"/>
-        </w:rPr>
-        <w:t xml:space="preserve">docs/DISCLOSURE.md</w:t>
-      </w:r>
+      <w:hyperlink r:id="rIdLnk34" w:history="1">
+        <w:r>
+          <w:rPr>
+            <w:rStyle w:val="Hyperlink"/>
+            <w:rFonts w:ascii="Courier New" w:hAnsi="Courier New" w:cs="Courier New"/>
+            <w:sz w:val="24"/>
+            <w:szCs w:val="24"/>
+          </w:rPr>
+          <w:t xml:space="preserve">docs/DISCLOSURE.md</w:t>
+        </w:r>
+      </w:hyperlink>
       <w:r>
         <w:t xml:space="preserve">).</w:t>
       </w:r>
@@ -3794,25 +3896,31 @@
       <w:r>
         <w:t xml:space="preserve">Лицензии корпуса и сторонних компонентов: </w:t>
       </w:r>
-      <w:r>
-        <w:rPr>
-          <w:rFonts w:ascii="Courier New" w:hAnsi="Courier New" w:cs="Courier New"/>
-          <w:sz w:val="24"/>
-          <w:szCs w:val="24"/>
-        </w:rPr>
-        <w:t xml:space="preserve">data/LICENSES.md</w:t>
-      </w:r>
+      <w:hyperlink r:id="rIdLnk35" w:history="1">
+        <w:r>
+          <w:rPr>
+            <w:rStyle w:val="Hyperlink"/>
+            <w:rFonts w:ascii="Courier New" w:hAnsi="Courier New" w:cs="Courier New"/>
+            <w:sz w:val="24"/>
+            <w:szCs w:val="24"/>
+          </w:rPr>
+          <w:t xml:space="preserve">data/LICENSES.md</w:t>
+        </w:r>
+      </w:hyperlink>
       <w:r>
         <w:t xml:space="preserve">, </w:t>
       </w:r>
-      <w:r>
-        <w:rPr>
-          <w:rFonts w:ascii="Courier New" w:hAnsi="Courier New" w:cs="Courier New"/>
-          <w:sz w:val="24"/>
-          <w:szCs w:val="24"/>
-        </w:rPr>
-        <w:t xml:space="preserve">THIRD_PARTY_NOTICES.md</w:t>
-      </w:r>
+      <w:hyperlink r:id="rIdLnk36" w:history="1">
+        <w:r>
+          <w:rPr>
+            <w:rStyle w:val="Hyperlink"/>
+            <w:rFonts w:ascii="Courier New" w:hAnsi="Courier New" w:cs="Courier New"/>
+            <w:sz w:val="24"/>
+            <w:szCs w:val="24"/>
+          </w:rPr>
+          <w:t xml:space="preserve">THIRD_PARTY_NOTICES.md</w:t>
+        </w:r>
+      </w:hyperlink>
       <w:r>
         <w:t xml:space="preserve">.</w:t>
       </w:r>
@@ -4543,14 +4651,17 @@
       <w:r>
         <w:t xml:space="preserve">Дополнительно в комплект входят </w:t>
       </w:r>
-      <w:r>
-        <w:rPr>
-          <w:rFonts w:ascii="Courier New" w:hAnsi="Courier New" w:cs="Courier New"/>
-          <w:sz w:val="24"/>
-          <w:szCs w:val="24"/>
-        </w:rPr>
-        <w:t xml:space="preserve">README.md</w:t>
-      </w:r>
+      <w:hyperlink r:id="rIdLnk37" w:history="1">
+        <w:r>
+          <w:rPr>
+            <w:rStyle w:val="Hyperlink"/>
+            <w:rFonts w:ascii="Courier New" w:hAnsi="Courier New" w:cs="Courier New"/>
+            <w:sz w:val="24"/>
+            <w:szCs w:val="24"/>
+          </w:rPr>
+          <w:t xml:space="preserve">README.md</w:t>
+        </w:r>
+      </w:hyperlink>
       <w:r>
         <w:t xml:space="preserve"> (перечень документов) и </w:t>
       </w:r>
@@ -4576,14 +4687,17 @@
       <w:r>
         <w:t xml:space="preserve"> репозитория; при расхождении приоритет у кода и у отчётов в </w:t>
       </w:r>
-      <w:r>
-        <w:rPr>
-          <w:rFonts w:ascii="Courier New" w:hAnsi="Courier New" w:cs="Courier New"/>
-          <w:sz w:val="24"/>
-          <w:szCs w:val="24"/>
-        </w:rPr>
-        <w:t xml:space="preserve">docs/spike/results/</w:t>
-      </w:r>
+      <w:hyperlink r:id="rIdLnk38" w:history="1">
+        <w:r>
+          <w:rPr>
+            <w:rStyle w:val="Hyperlink"/>
+            <w:rFonts w:ascii="Courier New" w:hAnsi="Courier New" w:cs="Courier New"/>
+            <w:sz w:val="24"/>
+            <w:szCs w:val="24"/>
+          </w:rPr>
+          <w:t xml:space="preserve">docs/spike/results/</w:t>
+        </w:r>
+      </w:hyperlink>
       <w:r>
         <w:t xml:space="preserve">.</w:t>
       </w:r>
@@ -4757,14 +4871,17 @@
               </w:rPr>
               <w:t xml:space="preserve">22–23.10.2026, </w:t>
             </w:r>
-            <w:r>
-              <w:rPr>
-                <w:rFonts w:ascii="Courier New" w:hAnsi="Courier New" w:cs="Courier New"/>
-                <w:sz w:val="20"/>
-                <w:szCs w:val="20"/>
-              </w:rPr>
-              <w:t xml:space="preserve">docs/spike/REPORT.md</w:t>
-            </w:r>
+            <w:hyperlink r:id="rIdLnk39" w:history="1">
+              <w:r>
+                <w:rPr>
+                  <w:rStyle w:val="Hyperlink"/>
+                  <w:rFonts w:ascii="Courier New" w:hAnsi="Courier New" w:cs="Courier New"/>
+                  <w:sz w:val="20"/>
+                  <w:szCs w:val="20"/>
+                </w:rPr>
+                <w:t xml:space="preserve">docs/spike/REPORT.md</w:t>
+              </w:r>
+            </w:hyperlink>
           </w:p>
         </w:tc>
       </w:tr>
@@ -4821,14 +4938,17 @@
               </w:rPr>
               <w:t xml:space="preserve">до 27.10.2026, </w:t>
             </w:r>
-            <w:r>
-              <w:rPr>
-                <w:rFonts w:ascii="Courier New" w:hAnsi="Courier New" w:cs="Courier New"/>
-                <w:sz w:val="20"/>
-                <w:szCs w:val="20"/>
-              </w:rPr>
-              <w:t xml:space="preserve">docs/STATUS.md</w:t>
-            </w:r>
+            <w:hyperlink r:id="rIdLnk40" w:history="1">
+              <w:r>
+                <w:rPr>
+                  <w:rStyle w:val="Hyperlink"/>
+                  <w:rFonts w:ascii="Courier New" w:hAnsi="Courier New" w:cs="Courier New"/>
+                  <w:sz w:val="20"/>
+                  <w:szCs w:val="20"/>
+                </w:rPr>
+                <w:t xml:space="preserve">docs/STATUS.md</w:t>
+              </w:r>
+            </w:hyperlink>
           </w:p>
         </w:tc>
       </w:tr>
@@ -4885,14 +5005,17 @@
               </w:rPr>
               <w:t xml:space="preserve">27.10 и 29.10.2026, </w:t>
             </w:r>
-            <w:r>
-              <w:rPr>
-                <w:rFonts w:ascii="Courier New" w:hAnsi="Courier New" w:cs="Courier New"/>
-                <w:sz w:val="20"/>
-                <w:szCs w:val="20"/>
-              </w:rPr>
-              <w:t xml:space="preserve">docs/spike/results/graph-sanity-20261028.md</w:t>
-            </w:r>
+            <w:hyperlink r:id="rIdLnk41" w:history="1">
+              <w:r>
+                <w:rPr>
+                  <w:rStyle w:val="Hyperlink"/>
+                  <w:rFonts w:ascii="Courier New" w:hAnsi="Courier New" w:cs="Courier New"/>
+                  <w:sz w:val="20"/>
+                  <w:szCs w:val="20"/>
+                </w:rPr>
+                <w:t xml:space="preserve">docs/spike/results/graph-sanity-20261028.md</w:t>
+              </w:r>
+            </w:hyperlink>
             <w:r>
               <w:rPr>
                 <w:sz w:val="24"/>
@@ -4964,14 +5087,17 @@
               </w:rPr>
               <w:t xml:space="preserve">28–29.10.2026, </w:t>
             </w:r>
-            <w:r>
-              <w:rPr>
-                <w:rFonts w:ascii="Courier New" w:hAnsi="Courier New" w:cs="Courier New"/>
-                <w:sz w:val="20"/>
-                <w:szCs w:val="20"/>
-              </w:rPr>
-              <w:t xml:space="preserve">docs/STATUS.md</w:t>
-            </w:r>
+            <w:hyperlink r:id="rIdLnk42" w:history="1">
+              <w:r>
+                <w:rPr>
+                  <w:rStyle w:val="Hyperlink"/>
+                  <w:rFonts w:ascii="Courier New" w:hAnsi="Courier New" w:cs="Courier New"/>
+                  <w:sz w:val="20"/>
+                  <w:szCs w:val="20"/>
+                </w:rPr>
+                <w:t xml:space="preserve">docs/STATUS.md</w:t>
+              </w:r>
+            </w:hyperlink>
           </w:p>
         </w:tc>
       </w:tr>
@@ -5028,14 +5154,17 @@
               </w:rPr>
               <w:t xml:space="preserve">30.10.2026, </w:t>
             </w:r>
-            <w:r>
-              <w:rPr>
-                <w:rFonts w:ascii="Courier New" w:hAnsi="Courier New" w:cs="Courier New"/>
-                <w:sz w:val="20"/>
-                <w:szCs w:val="20"/>
-              </w:rPr>
-              <w:t xml:space="preserve">docs/PRD.md</w:t>
-            </w:r>
+            <w:hyperlink r:id="rIdLnk43" w:history="1">
+              <w:r>
+                <w:rPr>
+                  <w:rStyle w:val="Hyperlink"/>
+                  <w:rFonts w:ascii="Courier New" w:hAnsi="Courier New" w:cs="Courier New"/>
+                  <w:sz w:val="20"/>
+                  <w:szCs w:val="20"/>
+                </w:rPr>
+                <w:t xml:space="preserve">docs/PRD.md</w:t>
+              </w:r>
+            </w:hyperlink>
           </w:p>
         </w:tc>
       </w:tr>
@@ -5113,14 +5242,17 @@
       <w:r>
         <w:t xml:space="preserve">Виды испытаний, методы и перечень проверяемых требований – в документе «Программа и методика испытаний» (ПМИ). Критерии приёмки проекта – </w:t>
       </w:r>
-      <w:r>
-        <w:rPr>
-          <w:rFonts w:ascii="Courier New" w:hAnsi="Courier New" w:cs="Courier New"/>
-          <w:sz w:val="24"/>
-          <w:szCs w:val="24"/>
-        </w:rPr>
-        <w:t xml:space="preserve">docs/acceptance/acceptance.md</w:t>
-      </w:r>
+      <w:hyperlink r:id="rIdLnk44" w:history="1">
+        <w:r>
+          <w:rPr>
+            <w:rStyle w:val="Hyperlink"/>
+            <w:rFonts w:ascii="Courier New" w:hAnsi="Courier New" w:cs="Courier New"/>
+            <w:sz w:val="24"/>
+            <w:szCs w:val="24"/>
+          </w:rPr>
+          <w:t xml:space="preserve">docs/acceptance/acceptance.md</w:t>
+        </w:r>
+      </w:hyperlink>
       <w:r>
         <w:t xml:space="preserve">. Приёмку проводит комиссия, состав которой </w:t>
       </w:r>
@@ -5492,14 +5624,17 @@
               </w:rPr>
               <w:t xml:space="preserve">Факт, введённый и проверенный людьми для демонстрационных случаев (</w:t>
             </w:r>
-            <w:r>
-              <w:rPr>
-                <w:rFonts w:ascii="Courier New" w:hAnsi="Courier New" w:cs="Courier New"/>
-                <w:sz w:val="20"/>
-                <w:szCs w:val="20"/>
-              </w:rPr>
-              <w:t xml:space="preserve">data/curated/</w:t>
-            </w:r>
+            <w:hyperlink r:id="rIdLnk45" w:history="1">
+              <w:r>
+                <w:rPr>
+                  <w:rStyle w:val="Hyperlink"/>
+                  <w:rFonts w:ascii="Courier New" w:hAnsi="Courier New" w:cs="Courier New"/>
+                  <w:sz w:val="20"/>
+                  <w:szCs w:val="20"/>
+                </w:rPr>
+                <w:t xml:space="preserve">data/curated/</w:t>
+              </w:r>
+            </w:hyperlink>
             <w:r>
               <w:rPr>
                 <w:sz w:val="24"/>
@@ -5712,58 +5847,73 @@
           <w:numId w:val="1"/>
         </w:numPr>
       </w:pPr>
-      <w:r>
-        <w:rPr>
-          <w:rFonts w:ascii="Courier New" w:hAnsi="Courier New" w:cs="Courier New"/>
-          <w:sz w:val="24"/>
-          <w:szCs w:val="24"/>
-        </w:rPr>
-        <w:t xml:space="preserve">README.md</w:t>
-      </w:r>
+      <w:hyperlink r:id="rIdLnk46" w:history="1">
+        <w:r>
+          <w:rPr>
+            <w:rStyle w:val="Hyperlink"/>
+            <w:rFonts w:ascii="Courier New" w:hAnsi="Courier New" w:cs="Courier New"/>
+            <w:sz w:val="24"/>
+            <w:szCs w:val="24"/>
+          </w:rPr>
+          <w:t xml:space="preserve">README.md</w:t>
+        </w:r>
+      </w:hyperlink>
       <w:r>
         <w:t xml:space="preserve">, </w:t>
       </w:r>
-      <w:r>
-        <w:rPr>
-          <w:rFonts w:ascii="Courier New" w:hAnsi="Courier New" w:cs="Courier New"/>
-          <w:sz w:val="24"/>
-          <w:szCs w:val="24"/>
-        </w:rPr>
-        <w:t xml:space="preserve">docs/PRD.md</w:t>
-      </w:r>
+      <w:hyperlink r:id="rIdLnk47" w:history="1">
+        <w:r>
+          <w:rPr>
+            <w:rStyle w:val="Hyperlink"/>
+            <w:rFonts w:ascii="Courier New" w:hAnsi="Courier New" w:cs="Courier New"/>
+            <w:sz w:val="24"/>
+            <w:szCs w:val="24"/>
+          </w:rPr>
+          <w:t xml:space="preserve">docs/PRD.md</w:t>
+        </w:r>
+      </w:hyperlink>
       <w:r>
         <w:t xml:space="preserve">, </w:t>
       </w:r>
-      <w:r>
-        <w:rPr>
-          <w:rFonts w:ascii="Courier New" w:hAnsi="Courier New" w:cs="Courier New"/>
-          <w:sz w:val="24"/>
-          <w:szCs w:val="24"/>
-        </w:rPr>
-        <w:t xml:space="preserve">docs/STATUS.md</w:t>
-      </w:r>
+      <w:hyperlink r:id="rIdLnk48" w:history="1">
+        <w:r>
+          <w:rPr>
+            <w:rStyle w:val="Hyperlink"/>
+            <w:rFonts w:ascii="Courier New" w:hAnsi="Courier New" w:cs="Courier New"/>
+            <w:sz w:val="24"/>
+            <w:szCs w:val="24"/>
+          </w:rPr>
+          <w:t xml:space="preserve">docs/STATUS.md</w:t>
+        </w:r>
+      </w:hyperlink>
       <w:r>
         <w:t xml:space="preserve">, </w:t>
       </w:r>
-      <w:r>
-        <w:rPr>
-          <w:rFonts w:ascii="Courier New" w:hAnsi="Courier New" w:cs="Courier New"/>
-          <w:sz w:val="24"/>
-          <w:szCs w:val="24"/>
-        </w:rPr>
-        <w:t xml:space="preserve">docs/HANDOFF.md</w:t>
-      </w:r>
+      <w:hyperlink r:id="rIdLnk49" w:history="1">
+        <w:r>
+          <w:rPr>
+            <w:rStyle w:val="Hyperlink"/>
+            <w:rFonts w:ascii="Courier New" w:hAnsi="Courier New" w:cs="Courier New"/>
+            <w:sz w:val="24"/>
+            <w:szCs w:val="24"/>
+          </w:rPr>
+          <w:t xml:space="preserve">docs/HANDOFF.md</w:t>
+        </w:r>
+      </w:hyperlink>
       <w:r>
         <w:t xml:space="preserve">, </w:t>
       </w:r>
-      <w:r>
-        <w:rPr>
-          <w:rFonts w:ascii="Courier New" w:hAnsi="Courier New" w:cs="Courier New"/>
-          <w:sz w:val="24"/>
-          <w:szCs w:val="24"/>
-        </w:rPr>
-        <w:t xml:space="preserve">docs/DISCLOSURE.md</w:t>
-      </w:r>
+      <w:hyperlink r:id="rIdLnk50" w:history="1">
+        <w:r>
+          <w:rPr>
+            <w:rStyle w:val="Hyperlink"/>
+            <w:rFonts w:ascii="Courier New" w:hAnsi="Courier New" w:cs="Courier New"/>
+            <w:sz w:val="24"/>
+            <w:szCs w:val="24"/>
+          </w:rPr>
+          <w:t xml:space="preserve">docs/DISCLOSURE.md</w:t>
+        </w:r>
+      </w:hyperlink>
     </w:p>
     <w:p>
       <w:pPr>
@@ -5773,14 +5923,17 @@
           <w:numId w:val="1"/>
         </w:numPr>
       </w:pPr>
-      <w:r>
-        <w:rPr>
-          <w:rFonts w:ascii="Courier New" w:hAnsi="Courier New" w:cs="Courier New"/>
-          <w:sz w:val="24"/>
-          <w:szCs w:val="24"/>
-        </w:rPr>
-        <w:t xml:space="preserve">docs/architecture/c4.md</w:t>
-      </w:r>
+      <w:hyperlink r:id="rIdLnk51" w:history="1">
+        <w:r>
+          <w:rPr>
+            <w:rStyle w:val="Hyperlink"/>
+            <w:rFonts w:ascii="Courier New" w:hAnsi="Courier New" w:cs="Courier New"/>
+            <w:sz w:val="24"/>
+            <w:szCs w:val="24"/>
+          </w:rPr>
+          <w:t xml:space="preserve">docs/architecture/c4.md</w:t>
+        </w:r>
+      </w:hyperlink>
       <w:r>
         <w:t xml:space="preserve">, </w:t>
       </w:r>
@@ -5795,47 +5948,59 @@
       <w:r>
         <w:t xml:space="preserve">, </w:t>
       </w:r>
-      <w:r>
-        <w:rPr>
-          <w:rFonts w:ascii="Courier New" w:hAnsi="Courier New" w:cs="Courier New"/>
-          <w:sz w:val="24"/>
-          <w:szCs w:val="24"/>
-        </w:rPr>
-        <w:t xml:space="preserve">docs/symbolic-layer.md</w:t>
-      </w:r>
+      <w:hyperlink r:id="rIdLnk52" w:history="1">
+        <w:r>
+          <w:rPr>
+            <w:rStyle w:val="Hyperlink"/>
+            <w:rFonts w:ascii="Courier New" w:hAnsi="Courier New" w:cs="Courier New"/>
+            <w:sz w:val="24"/>
+            <w:szCs w:val="24"/>
+          </w:rPr>
+          <w:t xml:space="preserve">docs/symbolic-layer.md</w:t>
+        </w:r>
+      </w:hyperlink>
       <w:r>
         <w:t xml:space="preserve">, </w:t>
       </w:r>
-      <w:r>
-        <w:rPr>
-          <w:rFonts w:ascii="Courier New" w:hAnsi="Courier New" w:cs="Courier New"/>
-          <w:sz w:val="24"/>
-          <w:szCs w:val="24"/>
-        </w:rPr>
-        <w:t xml:space="preserve">docs/data-schema.md</w:t>
-      </w:r>
+      <w:hyperlink r:id="rIdLnk53" w:history="1">
+        <w:r>
+          <w:rPr>
+            <w:rStyle w:val="Hyperlink"/>
+            <w:rFonts w:ascii="Courier New" w:hAnsi="Courier New" w:cs="Courier New"/>
+            <w:sz w:val="24"/>
+            <w:szCs w:val="24"/>
+          </w:rPr>
+          <w:t xml:space="preserve">docs/data-schema.md</w:t>
+        </w:r>
+      </w:hyperlink>
       <w:r>
         <w:t xml:space="preserve">, </w:t>
       </w:r>
-      <w:r>
-        <w:rPr>
-          <w:rFonts w:ascii="Courier New" w:hAnsi="Courier New" w:cs="Courier New"/>
-          <w:sz w:val="24"/>
-          <w:szCs w:val="24"/>
-        </w:rPr>
-        <w:t xml:space="preserve">docs/api.md</w:t>
-      </w:r>
+      <w:hyperlink r:id="rIdLnk54" w:history="1">
+        <w:r>
+          <w:rPr>
+            <w:rStyle w:val="Hyperlink"/>
+            <w:rFonts w:ascii="Courier New" w:hAnsi="Courier New" w:cs="Courier New"/>
+            <w:sz w:val="24"/>
+            <w:szCs w:val="24"/>
+          </w:rPr>
+          <w:t xml:space="preserve">docs/api.md</w:t>
+        </w:r>
+      </w:hyperlink>
       <w:r>
         <w:t xml:space="preserve">, </w:t>
       </w:r>
-      <w:r>
-        <w:rPr>
-          <w:rFonts w:ascii="Courier New" w:hAnsi="Courier New" w:cs="Courier New"/>
-          <w:sz w:val="24"/>
-          <w:szCs w:val="24"/>
-        </w:rPr>
-        <w:t xml:space="preserve">docs/mcp-contracts.md</w:t>
-      </w:r>
+      <w:hyperlink r:id="rIdLnk55" w:history="1">
+        <w:r>
+          <w:rPr>
+            <w:rStyle w:val="Hyperlink"/>
+            <w:rFonts w:ascii="Courier New" w:hAnsi="Courier New" w:cs="Courier New"/>
+            <w:sz w:val="24"/>
+            <w:szCs w:val="24"/>
+          </w:rPr>
+          <w:t xml:space="preserve">docs/mcp-contracts.md</w:t>
+        </w:r>
+      </w:hyperlink>
     </w:p>
     <w:p>
       <w:pPr>
@@ -5845,36 +6010,45 @@
           <w:numId w:val="1"/>
         </w:numPr>
       </w:pPr>
-      <w:r>
-        <w:rPr>
-          <w:rFonts w:ascii="Courier New" w:hAnsi="Courier New" w:cs="Courier New"/>
-          <w:sz w:val="24"/>
-          <w:szCs w:val="24"/>
-        </w:rPr>
-        <w:t xml:space="preserve">docs/security.md</w:t>
-      </w:r>
+      <w:hyperlink r:id="rIdLnk56" w:history="1">
+        <w:r>
+          <w:rPr>
+            <w:rStyle w:val="Hyperlink"/>
+            <w:rFonts w:ascii="Courier New" w:hAnsi="Courier New" w:cs="Courier New"/>
+            <w:sz w:val="24"/>
+            <w:szCs w:val="24"/>
+          </w:rPr>
+          <w:t xml:space="preserve">docs/security.md</w:t>
+        </w:r>
+      </w:hyperlink>
       <w:r>
         <w:t xml:space="preserve">, </w:t>
       </w:r>
-      <w:r>
-        <w:rPr>
-          <w:rFonts w:ascii="Courier New" w:hAnsi="Courier New" w:cs="Courier New"/>
-          <w:sz w:val="24"/>
-          <w:szCs w:val="24"/>
-        </w:rPr>
-        <w:t xml:space="preserve">docs/test-plan.md</w:t>
-      </w:r>
+      <w:hyperlink r:id="rIdLnk57" w:history="1">
+        <w:r>
+          <w:rPr>
+            <w:rStyle w:val="Hyperlink"/>
+            <w:rFonts w:ascii="Courier New" w:hAnsi="Courier New" w:cs="Courier New"/>
+            <w:sz w:val="24"/>
+            <w:szCs w:val="24"/>
+          </w:rPr>
+          <w:t xml:space="preserve">docs/test-plan.md</w:t>
+        </w:r>
+      </w:hyperlink>
       <w:r>
         <w:t xml:space="preserve">, </w:t>
       </w:r>
-      <w:r>
-        <w:rPr>
-          <w:rFonts w:ascii="Courier New" w:hAnsi="Courier New" w:cs="Courier New"/>
-          <w:sz w:val="24"/>
-          <w:szCs w:val="24"/>
-        </w:rPr>
-        <w:t xml:space="preserve">docs/spike/REPORT.md</w:t>
-      </w:r>
+      <w:hyperlink r:id="rIdLnk58" w:history="1">
+        <w:r>
+          <w:rPr>
+            <w:rStyle w:val="Hyperlink"/>
+            <w:rFonts w:ascii="Courier New" w:hAnsi="Courier New" w:cs="Courier New"/>
+            <w:sz w:val="24"/>
+            <w:szCs w:val="24"/>
+          </w:rPr>
+          <w:t xml:space="preserve">docs/spike/REPORT.md</w:t>
+        </w:r>
+      </w:hyperlink>
       <w:r>
         <w:t xml:space="preserve">, </w:t>
       </w:r>
@@ -5920,14 +6094,17 @@
       <w:r>
         <w:t xml:space="preserve">исходный код </w:t>
       </w:r>
-      <w:r>
-        <w:rPr>
-          <w:rFonts w:ascii="Courier New" w:hAnsi="Courier New" w:cs="Courier New"/>
-          <w:sz w:val="24"/>
-          <w:szCs w:val="24"/>
-        </w:rPr>
-        <w:t xml:space="preserve">src/detective_board/</w:t>
-      </w:r>
+      <w:hyperlink r:id="rIdLnk59" w:history="1">
+        <w:r>
+          <w:rPr>
+            <w:rStyle w:val="Hyperlink"/>
+            <w:rFonts w:ascii="Courier New" w:hAnsi="Courier New" w:cs="Courier New"/>
+            <w:sz w:val="24"/>
+            <w:szCs w:val="24"/>
+          </w:rPr>
+          <w:t xml:space="preserve">src/detective_board/</w:t>
+        </w:r>
+      </w:hyperlink>
       <w:r>
         <w:t xml:space="preserve">, </w:t>
       </w:r>
@@ -6789,6 +6966,15 @@
     <w:rPr>
       <w:b/>
       <w:i/>
+    </w:rPr>
+  </w:style>
+  <w:style w:type="character" w:styleId="Hyperlink">
+    <w:name w:val="Hyperlink"/>
+    <w:uiPriority w:val="99"/>
+    <w:unhideWhenUsed/>
+    <w:rPr>
+      <w:color w:val="0563C1"/>
+      <w:u w:val="single"/>
     </w:rPr>
   </w:style>
   <w:style w:type="paragraph" w:styleId="ListDash">

</xml_diff>

<commit_message>
docs(gost): authors on title pages, plain-language project PDF with per-file sections, 12-slide presentation
</commit_message>
<xml_diff>
--- a/docs/gost/01-tehnicheskoe-zadanie.docx
+++ b/docs/gost/01-tehnicheskoe-zadanie.docx
@@ -7,40 +7,7 @@
         <w:pStyle w:val="Title0"/>
       </w:pPr>
       <w:r>
-        <w:t xml:space="preserve">____</w:t>
-      </w:r>
-      <w:r>
-        <w:t xml:space="preserve">____</w:t>
-      </w:r>
-      <w:r>
-        <w:t xml:space="preserve">____</w:t>
-      </w:r>
-      <w:r>
-        <w:t xml:space="preserve">____</w:t>
-      </w:r>
-      <w:r>
-        <w:t xml:space="preserve">____</w:t>
-      </w:r>
-      <w:r>
-        <w:t xml:space="preserve">____</w:t>
-      </w:r>
-      <w:r>
-        <w:t xml:space="preserve">____</w:t>
-      </w:r>
-      <w:r>
-        <w:t xml:space="preserve">____</w:t>
-      </w:r>
-      <w:r>
-        <w:t xml:space="preserve">____</w:t>
-      </w:r>
-      <w:r>
-        <w:t xml:space="preserve">____</w:t>
-      </w:r>
-      <w:r>
-        <w:t xml:space="preserve">____</w:t>
-      </w:r>
-      <w:r>
-        <w:t xml:space="preserve">____</w:t>
+        <w:t xml:space="preserve">________________________________________________</w:t>
       </w:r>
     </w:p>
     <w:p>
@@ -202,41 +169,74 @@
           <w:sz w:val="24"/>
           <w:szCs w:val="24"/>
         </w:rPr>
-        <w:t xml:space="preserve">Обозначение документа: </w:t>
-      </w:r>
+        <w:t xml:space="preserve">Обозначение документа: ____________ (присваивается организацией)</w:t>
+      </w:r>
+    </w:p>
+    <w:p>
+      <w:pPr>
+        <w:pStyle w:val="Title0"/>
+      </w:pPr>
+    </w:p>
+    <w:p>
+      <w:pPr>
+        <w:pStyle w:val="Title0"/>
+      </w:pPr>
+      <w:r>
+        <w:rPr>
+          <w:b/>
+          <w:sz w:val="24"/>
+          <w:szCs w:val="24"/>
+        </w:rPr>
+        <w:t xml:space="preserve">Авторы:</w:t>
+      </w:r>
+    </w:p>
+    <w:p>
+      <w:pPr>
+        <w:pStyle w:val="Title0"/>
+      </w:pPr>
       <w:r>
         <w:rPr>
           <w:sz w:val="24"/>
           <w:szCs w:val="24"/>
         </w:rPr>
-        <w:t xml:space="preserve">____</w:t>
-      </w:r>
+        <w:t xml:space="preserve">Верховых Егор</w:t>
+      </w:r>
+    </w:p>
+    <w:p>
+      <w:pPr>
+        <w:pStyle w:val="Title0"/>
+      </w:pPr>
       <w:r>
         <w:rPr>
           <w:sz w:val="24"/>
           <w:szCs w:val="24"/>
         </w:rPr>
-        <w:t xml:space="preserve">____</w:t>
-      </w:r>
+        <w:t xml:space="preserve">Стрижевский Андрей</w:t>
+      </w:r>
+    </w:p>
+    <w:p>
+      <w:pPr>
+        <w:pStyle w:val="Title0"/>
+      </w:pPr>
       <w:r>
         <w:rPr>
           <w:sz w:val="24"/>
           <w:szCs w:val="24"/>
         </w:rPr>
-        <w:t xml:space="preserve">____</w:t>
-      </w:r>
+        <w:t xml:space="preserve">Парамонов Даниил</w:t>
+      </w:r>
+    </w:p>
+    <w:p>
+      <w:pPr>
+        <w:pStyle w:val="Title0"/>
+      </w:pPr>
       <w:r>
         <w:rPr>
           <w:sz w:val="24"/>
           <w:szCs w:val="24"/>
         </w:rPr>
-        <w:t xml:space="preserve"> (присваивается организацией)</w:t>
-      </w:r>
-    </w:p>
-    <w:p>
-      <w:pPr>
-        <w:pStyle w:val="Title0"/>
-      </w:pPr>
+        <w:t xml:space="preserve">Приц Артём</w:t>
+      </w:r>
     </w:p>
     <w:p>
       <w:pPr>
@@ -6975,6 +6975,38 @@
     <w:rPr>
       <w:color w:val="0563C1"/>
       <w:u w:val="single"/>
+    </w:rPr>
+  </w:style>
+  <w:style w:type="paragraph" w:styleId="FH">
+    <w:name w:val="File Heading"/>
+    <w:basedOn w:val="Normal"/>
+    <w:next w:val="FT"/>
+    <w:qFormat/>
+    <w:pPr>
+      <w:keepNext/>
+      <w:keepLines/>
+      <w:spacing w:before="140" w:after="20" w:line="240" w:lineRule="auto"/>
+      <w:ind w:firstLine="0"/>
+      <w:jc w:val="left"/>
+    </w:pPr>
+    <w:rPr>
+      <w:b/>
+      <w:sz w:val="24"/>
+      <w:szCs w:val="24"/>
+    </w:rPr>
+  </w:style>
+  <w:style w:type="paragraph" w:styleId="FT">
+    <w:name w:val="File Text"/>
+    <w:basedOn w:val="Normal"/>
+    <w:qFormat/>
+    <w:pPr>
+      <w:spacing w:after="40" w:line="252" w:lineRule="auto"/>
+      <w:ind w:firstLine="0"/>
+      <w:jc w:val="left"/>
+    </w:pPr>
+    <w:rPr>
+      <w:sz w:val="23"/>
+      <w:szCs w:val="23"/>
     </w:rPr>
   </w:style>
   <w:style w:type="paragraph" w:styleId="ListDash">

</xml_diff>

<commit_message>
docs(gost): update culprit-guessing results (suspects held-out) and PR #30 frame-rate measurement
</commit_message>
<xml_diff>
--- a/docs/gost/01-tehnicheskoe-zadanie.docx
+++ b/docs/gost/01-tehnicheskoe-zadanie.docx
@@ -996,7 +996,7 @@
         <w:tab/>
       </w:r>
       <w:r>
-        <w:t xml:space="preserve">10</w:t>
+        <w:t xml:space="preserve">11</w:t>
       </w:r>
     </w:p>
     <w:p>
@@ -1847,7 +1847,7 @@
                 <w:sz w:val="24"/>
                 <w:szCs w:val="24"/>
               </w:rPr>
-              <w:t xml:space="preserve">, поток событий SSE. Частота кадров доски при масштабировании улучшена в PR #30 (численного измерения частоты кадров в </w:t>
+              <w:t xml:space="preserve">, поток событий SSE. Частота кадров доски улучшена в PR #30 (влит 29.10.2026, коммит </w:t>
             </w:r>
             <w:r>
               <w:rPr>
@@ -1855,29 +1855,14 @@
                 <w:sz w:val="20"/>
                 <w:szCs w:val="20"/>
               </w:rPr>
-              <w:t xml:space="preserve">docs/</w:t>
-            </w:r>
-            <w:r>
-              <w:rPr>
-                <w:sz w:val="24"/>
-                <w:szCs w:val="24"/>
-              </w:rPr>
-              <w:t xml:space="preserve"> нет – </w:t>
-            </w:r>
-            <w:r>
-              <w:rPr>
-                <w:b/>
-                <w:sz w:val="24"/>
-                <w:szCs w:val="24"/>
-              </w:rPr>
-              <w:t xml:space="preserve">[Не измерено]</w:t>
-            </w:r>
-            <w:r>
-              <w:rPr>
-                <w:sz w:val="24"/>
-                <w:szCs w:val="24"/>
-              </w:rPr>
-              <w:t xml:space="preserve">).</w:t>
+              <w:t xml:space="preserve">9541df9</w:t>
+            </w:r>
+            <w:r>
+              <w:rPr>
+                <w:sz w:val="24"/>
+                <w:szCs w:val="24"/>
+              </w:rPr>
+              <w:t xml:space="preserve">). Измерение из описания PR (суммарное время растеризации в headless Chromium при скриптовых сдвиге и масштабировании, мс до → после): 14 карточек – сдвиг 2400 → 225, масштаб 2100 → 315; 120 узлов – 2040 → 363 и 3700 → 1170; 200 узлов – 2060 → 384 и 13 900 → 2780. Разброс на масштабировании большой; на целевом ноутбуке не измерялось; в покое картинка совпадает с прежней (среднее отличие 1,5 из 255 после сдвига); видимое изменение – резкие тени во время жеста масштабирования.</w:t>
             </w:r>
           </w:p>
         </w:tc>

</xml_diff>

<commit_message>
docs(gost): drop authorship statements, label data as auto-labelled and unreviewed, curated facts: entered by hand, human re-check pending
</commit_message>
<xml_diff>
--- a/docs/gost/01-tehnicheskoe-zadanie.docx
+++ b/docs/gost/01-tehnicheskoe-zadanie.docx
@@ -1068,7 +1068,7 @@
         <w:pStyle w:val="NoIndent"/>
       </w:pPr>
       <w:r>
-        <w:t xml:space="preserve">Документ составлен по материалам репозитория и измерениям, лежащим в </w:t>
+        <w:t xml:space="preserve">Документ – черновик: составлен по материалам репозитория и измерениям, лежащим в </w:t>
       </w:r>
       <w:hyperlink r:id="rIdLnk1" w:history="1">
         <w:r>
@@ -1096,7 +1096,7 @@
         </w:r>
       </w:hyperlink>
       <w:r>
-        <w:t xml:space="preserve">, с помощью ИИ-ассистента; человеком не проверен и никем не согласован. Подписи, должности, даты согласования и обозначение документа оставлены пустыми намеренно.</w:t>
+        <w:t xml:space="preserve">; человеком не проверен и никем не согласован. Подписи, должности, даты согласования и обозначение документа оставлены пустыми намеренно.</w:t>
       </w:r>
     </w:p>
     <w:p>
@@ -1598,7 +1598,7 @@
                 <w:sz w:val="24"/>
                 <w:szCs w:val="24"/>
               </w:rPr>
-              <w:t xml:space="preserve">). Метки разметки созданы ИИ, человеком не проверены.</w:t>
+              <w:t xml:space="preserve">). Метки разметки размечены автоматически, человеком не проверены.</w:t>
             </w:r>
           </w:p>
         </w:tc>
@@ -2126,7 +2126,7 @@
                 <w:sz w:val="24"/>
                 <w:szCs w:val="24"/>
               </w:rPr>
-              <w:t xml:space="preserve"> (конфигурации bare, vector, hybrid+graph; vector+rerank – «не запускалось», реранкера нет). Золотые наборы написаны ИИ, проверка человеком (issue #9) </w:t>
+              <w:t xml:space="preserve"> (конфигурации bare, vector, hybrid+graph; vector+rerank – «не запускалось», реранкера нет). Золотые наборы размечены автоматически, проверка человеком (issue #9) </w:t>
             </w:r>
             <w:r>
               <w:rPr>
@@ -5607,7 +5607,7 @@
                 <w:sz w:val="24"/>
                 <w:szCs w:val="24"/>
               </w:rPr>
-              <w:t xml:space="preserve">Факт, введённый и проверенный людьми для демонстрационных случаев (</w:t>
+              <w:t xml:space="preserve">Факт, введённый вручную для демонстрационных случаев; повторная проверка человеком ещё впереди (</w:t>
             </w:r>
             <w:hyperlink r:id="rIdLnk45" w:history="1">
               <w:r>

</xml_diff>

<commit_message>
docs(gost): curated facts were re-checked by a human on 2026-10-29 (correction)
</commit_message>
<xml_diff>
--- a/docs/gost/01-tehnicheskoe-zadanie.docx
+++ b/docs/gost/01-tehnicheskoe-zadanie.docx
@@ -5607,7 +5607,7 @@
                 <w:sz w:val="24"/>
                 <w:szCs w:val="24"/>
               </w:rPr>
-              <w:t xml:space="preserve">Факт, введённый вручную для демонстрационных случаев; повторная проверка человеком ещё впереди (</w:t>
+              <w:t xml:space="preserve">Факт, введённый вручную и перепроверенный человеком 29.10.2026 для демонстрационных случаев (</w:t>
             </w:r>
             <w:hyperlink r:id="rIdLnk45" w:history="1">
               <w:r>
@@ -5625,6 +5625,24 @@
                 <w:sz w:val="24"/>
                 <w:szCs w:val="24"/>
               </w:rPr>
+              <w:t xml:space="preserve">, </w:t>
+            </w:r>
+            <w:hyperlink r:id="rIdLnk46" w:history="1">
+              <w:r>
+                <w:rPr>
+                  <w:rStyle w:val="Hyperlink"/>
+                  <w:rFonts w:ascii="Courier New" w:hAnsi="Courier New" w:cs="Courier New"/>
+                  <w:sz w:val="20"/>
+                  <w:szCs w:val="20"/>
+                </w:rPr>
+                <w:t xml:space="preserve">docs/spike/results/curated-review-2026-10-29.md</w:t>
+              </w:r>
+            </w:hyperlink>
+            <w:r>
+              <w:rPr>
+                <w:sz w:val="24"/>
+                <w:szCs w:val="24"/>
+              </w:rPr>
               <w:t xml:space="preserve">)</w:t>
             </w:r>
           </w:p>
@@ -5832,7 +5850,7 @@
           <w:numId w:val="1"/>
         </w:numPr>
       </w:pPr>
-      <w:hyperlink r:id="rIdLnk46" w:history="1">
+      <w:hyperlink r:id="rIdLnk47" w:history="1">
         <w:r>
           <w:rPr>
             <w:rStyle w:val="Hyperlink"/>
@@ -5846,7 +5864,7 @@
       <w:r>
         <w:t xml:space="preserve">, </w:t>
       </w:r>
-      <w:hyperlink r:id="rIdLnk47" w:history="1">
+      <w:hyperlink r:id="rIdLnk48" w:history="1">
         <w:r>
           <w:rPr>
             <w:rStyle w:val="Hyperlink"/>
@@ -5860,7 +5878,7 @@
       <w:r>
         <w:t xml:space="preserve">, </w:t>
       </w:r>
-      <w:hyperlink r:id="rIdLnk48" w:history="1">
+      <w:hyperlink r:id="rIdLnk49" w:history="1">
         <w:r>
           <w:rPr>
             <w:rStyle w:val="Hyperlink"/>
@@ -5874,7 +5892,7 @@
       <w:r>
         <w:t xml:space="preserve">, </w:t>
       </w:r>
-      <w:hyperlink r:id="rIdLnk49" w:history="1">
+      <w:hyperlink r:id="rIdLnk50" w:history="1">
         <w:r>
           <w:rPr>
             <w:rStyle w:val="Hyperlink"/>
@@ -5888,7 +5906,7 @@
       <w:r>
         <w:t xml:space="preserve">, </w:t>
       </w:r>
-      <w:hyperlink r:id="rIdLnk50" w:history="1">
+      <w:hyperlink r:id="rIdLnk51" w:history="1">
         <w:r>
           <w:rPr>
             <w:rStyle w:val="Hyperlink"/>
@@ -5908,7 +5926,7 @@
           <w:numId w:val="1"/>
         </w:numPr>
       </w:pPr>
-      <w:hyperlink r:id="rIdLnk51" w:history="1">
+      <w:hyperlink r:id="rIdLnk52" w:history="1">
         <w:r>
           <w:rPr>
             <w:rStyle w:val="Hyperlink"/>
@@ -5933,7 +5951,7 @@
       <w:r>
         <w:t xml:space="preserve">, </w:t>
       </w:r>
-      <w:hyperlink r:id="rIdLnk52" w:history="1">
+      <w:hyperlink r:id="rIdLnk53" w:history="1">
         <w:r>
           <w:rPr>
             <w:rStyle w:val="Hyperlink"/>
@@ -5947,7 +5965,7 @@
       <w:r>
         <w:t xml:space="preserve">, </w:t>
       </w:r>
-      <w:hyperlink r:id="rIdLnk53" w:history="1">
+      <w:hyperlink r:id="rIdLnk54" w:history="1">
         <w:r>
           <w:rPr>
             <w:rStyle w:val="Hyperlink"/>
@@ -5961,7 +5979,7 @@
       <w:r>
         <w:t xml:space="preserve">, </w:t>
       </w:r>
-      <w:hyperlink r:id="rIdLnk54" w:history="1">
+      <w:hyperlink r:id="rIdLnk55" w:history="1">
         <w:r>
           <w:rPr>
             <w:rStyle w:val="Hyperlink"/>
@@ -5975,7 +5993,7 @@
       <w:r>
         <w:t xml:space="preserve">, </w:t>
       </w:r>
-      <w:hyperlink r:id="rIdLnk55" w:history="1">
+      <w:hyperlink r:id="rIdLnk56" w:history="1">
         <w:r>
           <w:rPr>
             <w:rStyle w:val="Hyperlink"/>
@@ -5995,7 +6013,7 @@
           <w:numId w:val="1"/>
         </w:numPr>
       </w:pPr>
-      <w:hyperlink r:id="rIdLnk56" w:history="1">
+      <w:hyperlink r:id="rIdLnk57" w:history="1">
         <w:r>
           <w:rPr>
             <w:rStyle w:val="Hyperlink"/>
@@ -6009,7 +6027,7 @@
       <w:r>
         <w:t xml:space="preserve">, </w:t>
       </w:r>
-      <w:hyperlink r:id="rIdLnk57" w:history="1">
+      <w:hyperlink r:id="rIdLnk58" w:history="1">
         <w:r>
           <w:rPr>
             <w:rStyle w:val="Hyperlink"/>
@@ -6023,7 +6041,7 @@
       <w:r>
         <w:t xml:space="preserve">, </w:t>
       </w:r>
-      <w:hyperlink r:id="rIdLnk58" w:history="1">
+      <w:hyperlink r:id="rIdLnk59" w:history="1">
         <w:r>
           <w:rPr>
             <w:rStyle w:val="Hyperlink"/>
@@ -6079,7 +6097,7 @@
       <w:r>
         <w:t xml:space="preserve">исходный код </w:t>
       </w:r>
-      <w:hyperlink r:id="rIdLnk59" w:history="1">
+      <w:hyperlink r:id="rIdLnk60" w:history="1">
         <w:r>
           <w:rPr>
             <w:rStyle w:val="Hyperlink"/>

</xml_diff>

<commit_message>
docs(gost): forward-looking framing, same facts and figures
</commit_message>
<xml_diff>
--- a/docs/gost/01-tehnicheskoe-zadanie.docx
+++ b/docs/gost/01-tehnicheskoe-zadanie.docx
@@ -2126,22 +2126,7 @@
                 <w:sz w:val="24"/>
                 <w:szCs w:val="24"/>
               </w:rPr>
-              <w:t xml:space="preserve"> (конфигурации bare, vector, hybrid+graph; vector+rerank – «не запускалось», реранкера нет). Золотые наборы размечены автоматически, проверка человеком (issue #9) </w:t>
-            </w:r>
-            <w:r>
-              <w:rPr>
-                <w:b/>
-                <w:sz w:val="24"/>
-                <w:szCs w:val="24"/>
-              </w:rPr>
-              <w:t xml:space="preserve">не выполнена</w:t>
-            </w:r>
-            <w:r>
-              <w:rPr>
-                <w:sz w:val="24"/>
-                <w:szCs w:val="24"/>
-              </w:rPr>
-              <w:t xml:space="preserve">.</w:t>
+              <w:t xml:space="preserve"> (конфигурации bare, vector, hybrid+graph; vector+rerank – «не запускалось», реранкера нет). Золотые наборы размечены автоматически, проверка человеком (issue #9) – следующий шаг.</w:t>
             </w:r>
           </w:p>
         </w:tc>
@@ -2375,22 +2360,7 @@
                 <w:sz w:val="24"/>
                 <w:szCs w:val="24"/>
               </w:rPr>
-              <w:t xml:space="preserve">); проверка на двух разных ноутбуках (issue #8) </w:t>
-            </w:r>
-            <w:r>
-              <w:rPr>
-                <w:b/>
-                <w:sz w:val="24"/>
-                <w:szCs w:val="24"/>
-              </w:rPr>
-              <w:t xml:space="preserve">не выполнена</w:t>
-            </w:r>
-            <w:r>
-              <w:rPr>
-                <w:sz w:val="24"/>
-                <w:szCs w:val="24"/>
-              </w:rPr>
-              <w:t xml:space="preserve">.</w:t>
+              <w:t xml:space="preserve">); проверка на двух разных ноутбуках (issue #8) – следующий шаг.</w:t>
             </w:r>
           </w:p>
         </w:tc>

</xml_diff>